<commit_message>
Protocolo Actual 13/05/2026 - limpieza eventos pasados, postulacion laboral Anelo registrada
</commit_message>
<xml_diff>
--- a/Agenda Personal - Maximiliano Marcellini.docx
+++ b/Agenda Personal - Maximiliano Marcellini.docx
@@ -75,7 +75,7 @@
           <w:sz w:val="18"/>
           <w:szCs w:val="18"/>
         </w:rPr>
-        <w:t>Última actualización: 06 de mayo de 2026</w:t>
+        <w:t>Última actualización: 13 de mayo de 2026</w:t>
       </w:r>
     </w:p>
     <w:p>
@@ -1332,7 +1332,7 @@
           </w:tcPr>
           <w:p>
             <w:r>
-              <w:t xml:space="preserve">SAProCEA — Matrícula en proceso (SOCIO ADHERENTE)</w:t>
+              <w:t xml:space="preserve">SAProCEA — ✅ Matriculado (SOCIO ADHERENTE)</w:t>
             </w:r>
           </w:p>
         </w:tc>
@@ -1378,7 +1378,7 @@
           </w:tcPr>
           <w:p>
             <w:r>
-              <w:t xml:space="preserve">✅ Documentación completa enviada el 05/05/2026. ✅ Sin mensualidades: la cuota anual es el único pago. Legajo en revisión por Comisión Directiva. Pendiente: certificado de matrícula + acceso al grupo de matriculados (boletines y ofertas de empleo). Ya puede realizar capacitaciones con descuento de matriculado. Relación con Congreso SAPROCEA 19-20/11/2026 (ya agendado).</w:t>
+              <w:t xml:space="preserve">✅ Documentación completa enviada el 05/05/2026. ✅ Sin mensualidades: la cuota anual es el único pago. ✅ Certificado de Matriculación recibido el 07/05/2026 (PDF con código QR de seguridad). Acceso al grupo de matriculados: pendiente confirmación. Ya puede realizar capacitaciones con descuento de matriculado. Relación con Congreso SAPROCEA 19-20/11/2026 (ya agendado).</w:t>
             </w:r>
           </w:p>
         </w:tc>
@@ -1468,7 +1468,7 @@
                 <w:sz w:val="18"/>
                 <w:szCs w:val="18"/>
               </w:rPr>
-              <w:t>✅ Copernicus/Sentinel-5P TROPOMI: COMPLETADO — 5.395 archivos procesados, 470 recortes exitosos sobre la región pampeana bonaerense. | ⏳ Dataset Blended TROPOMI+GOSAT (Balasus et al., 2023, Harvard): pendiente respuesta del Dr. Nicholas Balasus (email enviado 25/04/2026). | ⚠️ SEGUIMIENTO URGENTE (02/05/2026): límite 01/05 vencido — SIN RESPUESTA. Enviar email de seguimiento al Dr. Balasus HOY.</w:t>
+              <w:t>✅ Copernicus/Sentinel-5P TROPOMI: COMPLETADO — 5.395 archivos procesados, 470 recortes exitosos sobre la región pampeana bonaerense. | ✅ Dataset Blended TROPOMI+GOSAT (Balasus et al., 2023, Harvard): AUTORIZADO — Dr. Balasus confirmó el 06/05/2026: “That citation is sufficient.” Dataset disponible para uso en la tesis.</w:t>
             </w:r>
           </w:p>
         </w:tc>
@@ -2323,6 +2323,96 @@
                 <w:szCs w:val="18"/>
               </w:rPr>
               <w:t xml:space="preserve">Sin turno aún. Tomografía lista — gestionar turno (ya agendada para 20/05).</w:t>
+            </w:r>
+          </w:p>
+        </w:tc>
+      </w:tr>
+      <w:tr>
+        <w:tc>
+          <w:tcPr>
+            <w:tcW w:type="dxa" w:w="3200"/>
+            <w:tcBorders>
+              <w:top w:val="single" w:color="CCCCCC" w:sz="1"/>
+              <w:left w:val="single" w:color="CCCCCC" w:sz="1"/>
+              <w:bottom w:val="single" w:color="CCCCCC" w:sz="1"/>
+              <w:right w:val="single" w:color="CCCCCC" w:sz="1"/>
+            </w:tcBorders>
+            <w:shd w:fill="EBF5FB" w:val="clear"/>
+            <w:tcMar>
+              <w:top w:type="dxa" w:w="80"/>
+              <w:left w:type="dxa" w:w="120"/>
+              <w:bottom w:type="dxa" w:w="80"/>
+              <w:right w:type="dxa" w:w="120"/>
+            </w:tcMar>
+            <w:vAlign w:val="center"/>
+          </w:tcPr>
+          <w:p>
+            <w:r>
+              <w:rPr>
+                <w:b w:val="false"/>
+                <w:bCs w:val="false"/>
+                <w:sz w:val="18"/>
+                <w:szCs w:val="18"/>
+              </w:rPr>
+              <w:t>Postulación laboral — Técnico Medio Ambiente (Añelo)</w:t>
+            </w:r>
+          </w:p>
+        </w:tc>
+        <w:tc>
+          <w:tcPr>
+            <w:tcW w:type="dxa" w:w="1600"/>
+            <w:tcBorders>
+              <w:top w:val="single" w:color="CCCCCC" w:sz="1"/>
+              <w:left w:val="single" w:color="CCCCCC" w:sz="1"/>
+              <w:bottom w:val="single" w:color="CCCCCC" w:sz="1"/>
+              <w:right w:val="single" w:color="CCCCCC" w:sz="1"/>
+            </w:tcBorders>
+            <w:tcMar>
+              <w:top w:type="dxa" w:w="80"/>
+              <w:left w:type="dxa" w:w="120"/>
+              <w:bottom w:type="dxa" w:w="80"/>
+              <w:right w:type="dxa" w:w="120"/>
+            </w:tcMar>
+            <w:vAlign w:val="center"/>
+          </w:tcPr>
+          <w:p>
+            <w:r>
+              <w:rPr>
+                <w:b w:val="false"/>
+                <w:bCs w:val="false"/>
+                <w:sz w:val="18"/>
+                <w:szCs w:val="18"/>
+              </w:rPr>
+              <w:t>Media</w:t>
+            </w:r>
+          </w:p>
+        </w:tc>
+        <w:tc>
+          <w:tcPr>
+            <w:tcW w:type="dxa" w:w="4920"/>
+            <w:tcBorders>
+              <w:top w:val="single" w:color="CCCCCC" w:sz="1"/>
+              <w:left w:val="single" w:color="CCCCCC" w:sz="1"/>
+              <w:bottom w:val="single" w:color="CCCCCC" w:sz="1"/>
+              <w:right w:val="single" w:color="CCCCCC" w:sz="1"/>
+            </w:tcBorders>
+            <w:tcMar>
+              <w:top w:type="dxa" w:w="80"/>
+              <w:left w:type="dxa" w:w="120"/>
+              <w:bottom w:type="dxa" w:w="80"/>
+              <w:right w:type="dxa" w:w="120"/>
+            </w:tcMar>
+            <w:vAlign w:val="center"/>
+          </w:tcPr>
+          <w:p>
+            <w:r>
+              <w:rPr>
+                <w:b w:val="false"/>
+                <w:bCs w:val="false"/>
+                <w:sz w:val="18"/>
+                <w:szCs w:val="18"/>
+              </w:rPr>
+              <w:t>CV enviado el 13/05/2026 a rrhh@victorcontreras.com.ar. Empresa: Victor Contreras (zona Añelo, Neuquén). Puesto: Técnico en Medio Ambiente. Pendiente: respuesta de RRHH.</w:t>
             </w:r>
           </w:p>
         </w:tc>
@@ -2482,7 +2572,7 @@
                 <w:sz w:val="18"/>
                 <w:szCs w:val="18"/>
               </w:rPr>
-              <w:t xml:space="preserve">06/05/2026</w:t>
+              <w:t xml:space="preserve">13/05/2026</w:t>
             </w:r>
           </w:p>
         </w:tc>
@@ -2511,7 +2601,7 @@
                 <w:sz w:val="18"/>
                 <w:szCs w:val="18"/>
               </w:rPr>
-              <w:t xml:space="preserve">18:00 hs</w:t>
+              <w:t xml:space="preserve">17:00–18:00 hs</w:t>
             </w:r>
           </w:p>
         </w:tc>
@@ -2540,7 +2630,7 @@
                 <w:sz w:val="18"/>
                 <w:szCs w:val="18"/>
               </w:rPr>
-              <w:t xml:space="preserve">Nutricionista (Olleros 2411)</w:t>
+              <w:t xml:space="preserve">Striping + Baño Chet — Cap. Gral. Ramón Freire 2401</w:t>
             </w:r>
           </w:p>
         </w:tc>
@@ -2555,24 +2645,23 @@
               <w:bottom w:val="single" w:color="CCCCCC" w:sz="1"/>
               <w:right w:val="single" w:color="CCCCCC" w:sz="1"/>
             </w:tcBorders>
-            <w:shd w:fill="F8F9FA" w:val="clear"/>
-            <w:tcMar>
-              <w:top w:type="dxa" w:w="80"/>
-              <w:left w:type="dxa" w:w="120"/>
-              <w:bottom w:type="dxa" w:w="80"/>
-              <w:right w:type="dxa" w:w="120"/>
-            </w:tcMar>
-            <w:vAlign w:val="center"/>
-          </w:tcPr>
-          <w:p>
-            <w:r>
-              <w:rPr>
-                <w:b w:val="false"/>
-                <w:bCs w:val="false"/>
-                <w:sz w:val="18"/>
-                <w:szCs w:val="18"/>
-              </w:rPr>
-              <w:t xml:space="preserve">08/05/2026</w:t>
+            <w:tcMar>
+              <w:top w:type="dxa" w:w="80"/>
+              <w:left w:type="dxa" w:w="120"/>
+              <w:bottom w:type="dxa" w:w="80"/>
+              <w:right w:type="dxa" w:w="120"/>
+            </w:tcMar>
+            <w:vAlign w:val="center"/>
+          </w:tcPr>
+          <w:p>
+            <w:r>
+              <w:rPr>
+                <w:b w:val="false"/>
+                <w:bCs w:val="false"/>
+                <w:sz w:val="18"/>
+                <w:szCs w:val="18"/>
+              </w:rPr>
+              <w:t>17/05/2026</w:t>
             </w:r>
           </w:p>
         </w:tc>
@@ -2601,7 +2690,7 @@
                 <w:sz w:val="18"/>
                 <w:szCs w:val="18"/>
               </w:rPr>
-              <w:t xml:space="preserve">—</w:t>
+              <w:t>—</w:t>
             </w:r>
           </w:p>
         </w:tc>
@@ -2630,7 +2719,7 @@
                 <w:sz w:val="18"/>
                 <w:szCs w:val="18"/>
               </w:rPr>
-              <w:t xml:space="preserve">Cumpleaños Novios (anual)</w:t>
+              <w:t>🏃 Salida MB Running</w:t>
             </w:r>
           </w:p>
         </w:tc>
@@ -2645,24 +2734,24 @@
               <w:bottom w:val="single" w:color="CCCCCC" w:sz="1"/>
               <w:right w:val="single" w:color="CCCCCC" w:sz="1"/>
             </w:tcBorders>
-            <w:shd w:fill="F8F9FA" w:val="clear"/>
-            <w:tcMar>
-              <w:top w:type="dxa" w:w="80"/>
-              <w:left w:type="dxa" w:w="120"/>
-              <w:bottom w:type="dxa" w:w="80"/>
-              <w:right w:type="dxa" w:w="120"/>
-            </w:tcMar>
-            <w:vAlign w:val="center"/>
-          </w:tcPr>
-          <w:p>
-            <w:r>
-              <w:rPr>
-                <w:b w:val="false"/>
-                <w:bCs w:val="false"/>
-                <w:sz w:val="18"/>
-                <w:szCs w:val="18"/>
-              </w:rPr>
-              <w:t xml:space="preserve">09/05/2026</w:t>
+            <w:shd w:fill="D5F5E3" w:val="clear"/>
+            <w:tcMar>
+              <w:top w:type="dxa" w:w="80"/>
+              <w:left w:type="dxa" w:w="120"/>
+              <w:bottom w:type="dxa" w:w="80"/>
+              <w:right w:type="dxa" w:w="120"/>
+            </w:tcMar>
+            <w:vAlign w:val="center"/>
+          </w:tcPr>
+          <w:p>
+            <w:r>
+              <w:rPr>
+                <w:b w:val="false"/>
+                <w:bCs w:val="false"/>
+                <w:sz w:val="18"/>
+                <w:szCs w:val="18"/>
+              </w:rPr>
+              <w:t xml:space="preserve">18/05/2026</w:t>
             </w:r>
           </w:p>
         </w:tc>
@@ -2691,7 +2780,7 @@
                 <w:sz w:val="18"/>
                 <w:szCs w:val="18"/>
               </w:rPr>
-              <w:t xml:space="preserve">—</w:t>
+              <w:t xml:space="preserve">16:30–17:30 hs</w:t>
             </w:r>
           </w:p>
         </w:tc>
@@ -2720,7 +2809,7 @@
                 <w:sz w:val="18"/>
                 <w:szCs w:val="18"/>
               </w:rPr>
-              <w:t xml:space="preserve">Cumpleaños de Eloísa (anual)</w:t>
+              <w:t xml:space="preserve">Oftalmología — posible estudio previo al turno del 27/05</w:t>
             </w:r>
           </w:p>
         </w:tc>
@@ -2735,24 +2824,23 @@
               <w:bottom w:val="single" w:color="CCCCCC" w:sz="1"/>
               <w:right w:val="single" w:color="CCCCCC" w:sz="1"/>
             </w:tcBorders>
-            <w:shd w:fill="FEF9C3" w:val="clear"/>
-            <w:tcMar>
-              <w:top w:type="dxa" w:w="80"/>
-              <w:left w:type="dxa" w:w="120"/>
-              <w:bottom w:type="dxa" w:w="80"/>
-              <w:right w:type="dxa" w:w="120"/>
-            </w:tcMar>
-            <w:vAlign w:val="center"/>
-          </w:tcPr>
-          <w:p>
-            <w:r>
-              <w:rPr>
-                <w:b w:val="false"/>
-                <w:bCs w:val="false"/>
-                <w:sz w:val="18"/>
-                <w:szCs w:val="18"/>
-              </w:rPr>
-              <w:t xml:space="preserve">11/05/2026</w:t>
+            <w:tcMar>
+              <w:top w:type="dxa" w:w="80"/>
+              <w:left w:type="dxa" w:w="120"/>
+              <w:bottom w:type="dxa" w:w="80"/>
+              <w:right w:type="dxa" w:w="120"/>
+            </w:tcMar>
+            <w:vAlign w:val="center"/>
+          </w:tcPr>
+          <w:p>
+            <w:r>
+              <w:rPr>
+                <w:b w:val="false"/>
+                <w:bCs w:val="false"/>
+                <w:sz w:val="18"/>
+                <w:szCs w:val="18"/>
+              </w:rPr>
+              <w:t xml:space="preserve">20/05/2026</w:t>
             </w:r>
           </w:p>
         </w:tc>
@@ -2781,7 +2869,7 @@
                 <w:sz w:val="18"/>
                 <w:szCs w:val="18"/>
               </w:rPr>
-              <w:t xml:space="preserve">17:00–18:00 hs</w:t>
+              <w:t xml:space="preserve">14:00–21:00 hs</w:t>
             </w:r>
           </w:p>
         </w:tc>
@@ -2810,7 +2898,7 @@
                 <w:sz w:val="18"/>
                 <w:szCs w:val="18"/>
               </w:rPr>
-              <w:t xml:space="preserve">Reunión Tesis (con director) — 📌 Pedir tabla pesos vivos y digestibilidad por categoría animal para Tier 2 (vacas, vaquillonas, novillos, novillitos, terneros, toros) — fuente INTA/SENASA argentina</w:t>
+              <w:t xml:space="preserve">🎓 Acto de Colación (Universidad de la Ciudad) — detectado en Google Calendar el 04/05/2026</w:t>
             </w:r>
           </w:p>
         </w:tc>
@@ -2825,23 +2913,24 @@
               <w:bottom w:val="single" w:color="CCCCCC" w:sz="1"/>
               <w:right w:val="single" w:color="CCCCCC" w:sz="1"/>
             </w:tcBorders>
-            <w:tcMar>
-              <w:top w:type="dxa" w:w="80"/>
-              <w:left w:type="dxa" w:w="120"/>
-              <w:bottom w:type="dxa" w:w="80"/>
-              <w:right w:type="dxa" w:w="120"/>
-            </w:tcMar>
-            <w:vAlign w:val="center"/>
-          </w:tcPr>
-          <w:p>
-            <w:r>
-              <w:rPr>
-                <w:b w:val="false"/>
-                <w:bCs w:val="false"/>
-                <w:sz w:val="18"/>
-                <w:szCs w:val="18"/>
-              </w:rPr>
-              <w:t>17/05/2026</w:t>
+            <w:shd w:fill="D5F5E3" w:val="clear"/>
+            <w:tcMar>
+              <w:top w:type="dxa" w:w="80"/>
+              <w:left w:type="dxa" w:w="120"/>
+              <w:bottom w:type="dxa" w:w="80"/>
+              <w:right w:type="dxa" w:w="120"/>
+            </w:tcMar>
+            <w:vAlign w:val="center"/>
+          </w:tcPr>
+          <w:p>
+            <w:r>
+              <w:rPr>
+                <w:b w:val="false"/>
+                <w:bCs w:val="false"/>
+                <w:sz w:val="18"/>
+                <w:szCs w:val="18"/>
+              </w:rPr>
+              <w:t xml:space="preserve">21/05/2026</w:t>
             </w:r>
           </w:p>
         </w:tc>
@@ -2870,7 +2959,7 @@
                 <w:sz w:val="18"/>
                 <w:szCs w:val="18"/>
               </w:rPr>
-              <w:t>—</w:t>
+              <w:t xml:space="preserve">16:30–17:30 hs</w:t>
             </w:r>
           </w:p>
         </w:tc>
@@ -2899,7 +2988,7 @@
                 <w:sz w:val="18"/>
                 <w:szCs w:val="18"/>
               </w:rPr>
-              <w:t>🏃 Salida MB Running</w:t>
+              <w:t xml:space="preserve">Carie 2/3 + Ver Tomografía — llevar tomografía de dientes (ya realizada) al dentista</w:t>
             </w:r>
           </w:p>
         </w:tc>
@@ -2931,7 +3020,7 @@
                 <w:sz w:val="18"/>
                 <w:szCs w:val="18"/>
               </w:rPr>
-              <w:t xml:space="preserve">18/05/2026</w:t>
+              <w:t xml:space="preserve">27/05/2026</w:t>
             </w:r>
           </w:p>
         </w:tc>
@@ -2960,7 +3049,7 @@
                 <w:sz w:val="18"/>
                 <w:szCs w:val="18"/>
               </w:rPr>
-              <w:t xml:space="preserve">16:30–17:30 hs</w:t>
+              <w:t xml:space="preserve">11:00 hs</w:t>
             </w:r>
           </w:p>
         </w:tc>
@@ -2989,7 +3078,7 @@
                 <w:sz w:val="18"/>
                 <w:szCs w:val="18"/>
               </w:rPr>
-              <w:t xml:space="preserve">Oftalmología — posible estudio previo al turno del 27/05</w:t>
+              <w:t xml:space="preserve">Oftalmólogo — evaluación cirugía de ojos ✓ agendado</w:t>
             </w:r>
           </w:p>
         </w:tc>
@@ -3020,7 +3109,7 @@
                 <w:sz w:val="18"/>
                 <w:szCs w:val="18"/>
               </w:rPr>
-              <w:t xml:space="preserve">20/05/2026</w:t>
+              <w:t xml:space="preserve">31/05/2026</w:t>
             </w:r>
           </w:p>
         </w:tc>
@@ -3049,7 +3138,7 @@
                 <w:sz w:val="18"/>
                 <w:szCs w:val="18"/>
               </w:rPr>
-              <w:t xml:space="preserve">14:00–21:00 hs</w:t>
+              <w:t xml:space="preserve">—</w:t>
             </w:r>
           </w:p>
         </w:tc>
@@ -3078,7 +3167,7 @@
                 <w:sz w:val="18"/>
                 <w:szCs w:val="18"/>
               </w:rPr>
-              <w:t xml:space="preserve">🎓 Acto de Colación (Universidad de la Ciudad) — detectado en Google Calendar el 04/05/2026</w:t>
+              <w:t xml:space="preserve">⏰ Hito tesis: Excel con datos cruzados completo (SENASA + CNA + SMN listos)</w:t>
             </w:r>
           </w:p>
         </w:tc>
@@ -3093,24 +3182,24 @@
               <w:bottom w:val="single" w:color="CCCCCC" w:sz="1"/>
               <w:right w:val="single" w:color="CCCCCC" w:sz="1"/>
             </w:tcBorders>
-            <w:shd w:fill="D5F5E3" w:val="clear"/>
-            <w:tcMar>
-              <w:top w:type="dxa" w:w="80"/>
-              <w:left w:type="dxa" w:w="120"/>
-              <w:bottom w:type="dxa" w:w="80"/>
-              <w:right w:type="dxa" w:w="120"/>
-            </w:tcMar>
-            <w:vAlign w:val="center"/>
-          </w:tcPr>
-          <w:p>
-            <w:r>
-              <w:rPr>
-                <w:b w:val="false"/>
-                <w:bCs w:val="false"/>
-                <w:sz w:val="18"/>
-                <w:szCs w:val="18"/>
-              </w:rPr>
-              <w:t xml:space="preserve">21/05/2026</w:t>
+            <w:shd w:fill="F2F3F4" w:val="clear"/>
+            <w:tcMar>
+              <w:top w:type="dxa" w:w="80"/>
+              <w:left w:type="dxa" w:w="120"/>
+              <w:bottom w:type="dxa" w:w="80"/>
+              <w:right w:type="dxa" w:w="120"/>
+            </w:tcMar>
+            <w:vAlign w:val="center"/>
+          </w:tcPr>
+          <w:p>
+            <w:r>
+              <w:rPr>
+                <w:b w:val="false"/>
+                <w:bCs w:val="false"/>
+                <w:sz w:val="18"/>
+                <w:szCs w:val="18"/>
+              </w:rPr>
+              <w:t xml:space="preserve">01/06/2026</w:t>
             </w:r>
           </w:p>
         </w:tc>
@@ -3139,7 +3228,7 @@
                 <w:sz w:val="18"/>
                 <w:szCs w:val="18"/>
               </w:rPr>
-              <w:t xml:space="preserve">16:30–17:30 hs</w:t>
+              <w:t xml:space="preserve">—</w:t>
             </w:r>
           </w:p>
         </w:tc>
@@ -3168,7 +3257,7 @@
                 <w:sz w:val="18"/>
                 <w:szCs w:val="18"/>
               </w:rPr>
-              <w:t xml:space="preserve">Carie 2/3 + Ver Tomografía — llevar tomografía de dientes (ya realizada) al dentista</w:t>
+              <w:t xml:space="preserve">Cambiar filtro PSA (agua cocina)</w:t>
             </w:r>
           </w:p>
         </w:tc>
@@ -3183,24 +3272,24 @@
               <w:bottom w:val="single" w:color="CCCCCC" w:sz="1"/>
               <w:right w:val="single" w:color="CCCCCC" w:sz="1"/>
             </w:tcBorders>
-            <w:shd w:fill="D5F5E3" w:val="clear"/>
-            <w:tcMar>
-              <w:top w:type="dxa" w:w="80"/>
-              <w:left w:type="dxa" w:w="120"/>
-              <w:bottom w:type="dxa" w:w="80"/>
-              <w:right w:type="dxa" w:w="120"/>
-            </w:tcMar>
-            <w:vAlign w:val="center"/>
-          </w:tcPr>
-          <w:p>
-            <w:r>
-              <w:rPr>
-                <w:b w:val="false"/>
-                <w:bCs w:val="false"/>
-                <w:sz w:val="18"/>
-                <w:szCs w:val="18"/>
-              </w:rPr>
-              <w:t xml:space="preserve">27/05/2026</w:t>
+            <w:shd w:fill="F2F3F4" w:val="clear"/>
+            <w:tcMar>
+              <w:top w:type="dxa" w:w="80"/>
+              <w:left w:type="dxa" w:w="120"/>
+              <w:bottom w:type="dxa" w:w="80"/>
+              <w:right w:type="dxa" w:w="120"/>
+            </w:tcMar>
+            <w:vAlign w:val="center"/>
+          </w:tcPr>
+          <w:p>
+            <w:r>
+              <w:rPr>
+                <w:b w:val="false"/>
+                <w:bCs w:val="false"/>
+                <w:sz w:val="18"/>
+                <w:szCs w:val="18"/>
+              </w:rPr>
+              <w:t xml:space="preserve">03/06/2026</w:t>
             </w:r>
           </w:p>
         </w:tc>
@@ -3229,7 +3318,7 @@
                 <w:sz w:val="18"/>
                 <w:szCs w:val="18"/>
               </w:rPr>
-              <w:t xml:space="preserve">11:00 hs</w:t>
+              <w:t xml:space="preserve">18:00 hs</w:t>
             </w:r>
           </w:p>
         </w:tc>
@@ -3258,7 +3347,7 @@
                 <w:sz w:val="18"/>
                 <w:szCs w:val="18"/>
               </w:rPr>
-              <w:t xml:space="preserve">Oftalmólogo — evaluación cirugía de ojos ✓ agendado</w:t>
+              <w:t xml:space="preserve">Nutricionista (Olleros 2411)</w:t>
             </w:r>
           </w:p>
         </w:tc>
@@ -3273,23 +3362,24 @@
               <w:bottom w:val="single" w:color="CCCCCC" w:sz="1"/>
               <w:right w:val="single" w:color="CCCCCC" w:sz="1"/>
             </w:tcBorders>
-            <w:tcMar>
-              <w:top w:type="dxa" w:w="80"/>
-              <w:left w:type="dxa" w:w="120"/>
-              <w:bottom w:type="dxa" w:w="80"/>
-              <w:right w:type="dxa" w:w="120"/>
-            </w:tcMar>
-            <w:vAlign w:val="center"/>
-          </w:tcPr>
-          <w:p>
-            <w:r>
-              <w:rPr>
-                <w:b w:val="false"/>
-                <w:bCs w:val="false"/>
-                <w:sz w:val="18"/>
-                <w:szCs w:val="18"/>
-              </w:rPr>
-              <w:t xml:space="preserve">31/05/2026</w:t>
+            <w:shd w:fill="F8F9FA" w:val="clear"/>
+            <w:tcMar>
+              <w:top w:type="dxa" w:w="80"/>
+              <w:left w:type="dxa" w:w="120"/>
+              <w:bottom w:type="dxa" w:w="80"/>
+              <w:right w:type="dxa" w:w="120"/>
+            </w:tcMar>
+            <w:vAlign w:val="center"/>
+          </w:tcPr>
+          <w:p>
+            <w:r>
+              <w:rPr>
+                <w:b w:val="false"/>
+                <w:bCs w:val="false"/>
+                <w:sz w:val="18"/>
+                <w:szCs w:val="18"/>
+              </w:rPr>
+              <w:t xml:space="preserve">23/06/2026</w:t>
             </w:r>
           </w:p>
         </w:tc>
@@ -3347,7 +3437,7 @@
                 <w:sz w:val="18"/>
                 <w:szCs w:val="18"/>
               </w:rPr>
-              <w:t xml:space="preserve">⏰ Hito tesis: Excel con datos cruzados completo (SENASA + CNA + SMN listos)</w:t>
+              <w:t xml:space="preserve">Cumpleaños Euge (anual)</w:t>
             </w:r>
           </w:p>
         </w:tc>
@@ -3362,24 +3452,18 @@
               <w:bottom w:val="single" w:color="CCCCCC" w:sz="1"/>
               <w:right w:val="single" w:color="CCCCCC" w:sz="1"/>
             </w:tcBorders>
-            <w:shd w:fill="F2F3F4" w:val="clear"/>
-            <w:tcMar>
-              <w:top w:type="dxa" w:w="80"/>
-              <w:left w:type="dxa" w:w="120"/>
-              <w:bottom w:type="dxa" w:w="80"/>
-              <w:right w:type="dxa" w:w="120"/>
-            </w:tcMar>
-            <w:vAlign w:val="center"/>
-          </w:tcPr>
-          <w:p>
-            <w:r>
-              <w:rPr>
-                <w:b w:val="false"/>
-                <w:bCs w:val="false"/>
-                <w:sz w:val="18"/>
-                <w:szCs w:val="18"/>
-              </w:rPr>
-              <w:t xml:space="preserve">01/06/2026</w:t>
+            <w:shd w:fill="FEF9C3" w:val="clear"/>
+            <w:tcMar>
+              <w:top w:type="dxa" w:w="80"/>
+              <w:left w:type="dxa" w:w="120"/>
+              <w:bottom w:type="dxa" w:w="80"/>
+              <w:right w:type="dxa" w:w="120"/>
+            </w:tcMar>
+            <w:vAlign w:val="center"/>
+          </w:tcPr>
+          <w:p>
+            <w:r>
+              <w:t xml:space="preserve">27/06/2026</w:t>
             </w:r>
           </w:p>
         </w:tc>
@@ -3402,12 +3486,6 @@
           </w:tcPr>
           <w:p>
             <w:r>
-              <w:rPr>
-                <w:b w:val="false"/>
-                <w:bCs w:val="false"/>
-                <w:sz w:val="18"/>
-                <w:szCs w:val="18"/>
-              </w:rPr>
               <w:t xml:space="preserve">—</w:t>
             </w:r>
           </w:p>
@@ -3431,265 +3509,7 @@
           </w:tcPr>
           <w:p>
             <w:r>
-              <w:rPr>
-                <w:b w:val="false"/>
-                <w:bCs w:val="false"/>
-                <w:sz w:val="18"/>
-                <w:szCs w:val="18"/>
-              </w:rPr>
-              <w:t xml:space="preserve">Cambiar filtro PSA (agua cocina)</w:t>
-            </w:r>
-          </w:p>
-        </w:tc>
-      </w:tr>
-      <w:tr>
-        <w:tc>
-          <w:tcPr>
-            <w:tcW w:type="dxa" w:w="2000"/>
-            <w:tcBorders>
-              <w:top w:val="single" w:color="CCCCCC" w:sz="1"/>
-              <w:left w:val="single" w:color="CCCCCC" w:sz="1"/>
-              <w:bottom w:val="single" w:color="CCCCCC" w:sz="1"/>
-              <w:right w:val="single" w:color="CCCCCC" w:sz="1"/>
-            </w:tcBorders>
-            <w:shd w:fill="F2F3F4" w:val="clear"/>
-            <w:tcMar>
-              <w:top w:type="dxa" w:w="80"/>
-              <w:left w:type="dxa" w:w="120"/>
-              <w:bottom w:type="dxa" w:w="80"/>
-              <w:right w:type="dxa" w:w="120"/>
-            </w:tcMar>
-            <w:vAlign w:val="center"/>
-          </w:tcPr>
-          <w:p>
-            <w:r>
-              <w:rPr>
-                <w:b w:val="false"/>
-                <w:bCs w:val="false"/>
-                <w:sz w:val="18"/>
-                <w:szCs w:val="18"/>
-              </w:rPr>
-              <w:t xml:space="preserve">03/06/2026</w:t>
-            </w:r>
-          </w:p>
-        </w:tc>
-        <w:tc>
-          <w:tcPr>
-            <w:tcW w:type="dxa" w:w="1800"/>
-            <w:tcBorders>
-              <w:top w:val="single" w:color="CCCCCC" w:sz="1"/>
-              <w:left w:val="single" w:color="CCCCCC" w:sz="1"/>
-              <w:bottom w:val="single" w:color="CCCCCC" w:sz="1"/>
-              <w:right w:val="single" w:color="CCCCCC" w:sz="1"/>
-            </w:tcBorders>
-            <w:tcMar>
-              <w:top w:type="dxa" w:w="80"/>
-              <w:left w:type="dxa" w:w="120"/>
-              <w:bottom w:type="dxa" w:w="80"/>
-              <w:right w:type="dxa" w:w="120"/>
-            </w:tcMar>
-            <w:vAlign w:val="center"/>
-          </w:tcPr>
-          <w:p>
-            <w:r>
-              <w:rPr>
-                <w:b w:val="false"/>
-                <w:bCs w:val="false"/>
-                <w:sz w:val="18"/>
-                <w:szCs w:val="18"/>
-              </w:rPr>
-              <w:t xml:space="preserve">18:00 hs</w:t>
-            </w:r>
-          </w:p>
-        </w:tc>
-        <w:tc>
-          <w:tcPr>
-            <w:tcW w:type="dxa" w:w="5920"/>
-            <w:tcBorders>
-              <w:top w:val="single" w:color="CCCCCC" w:sz="1"/>
-              <w:left w:val="single" w:color="CCCCCC" w:sz="1"/>
-              <w:bottom w:val="single" w:color="CCCCCC" w:sz="1"/>
-              <w:right w:val="single" w:color="CCCCCC" w:sz="1"/>
-            </w:tcBorders>
-            <w:tcMar>
-              <w:top w:type="dxa" w:w="80"/>
-              <w:left w:type="dxa" w:w="120"/>
-              <w:bottom w:type="dxa" w:w="80"/>
-              <w:right w:type="dxa" w:w="120"/>
-            </w:tcMar>
-            <w:vAlign w:val="center"/>
-          </w:tcPr>
-          <w:p>
-            <w:r>
-              <w:rPr>
-                <w:b w:val="false"/>
-                <w:bCs w:val="false"/>
-                <w:sz w:val="18"/>
-                <w:szCs w:val="18"/>
-              </w:rPr>
-              <w:t xml:space="preserve">Nutricionista (Olleros 2411)</w:t>
-            </w:r>
-          </w:p>
-        </w:tc>
-      </w:tr>
-      <w:tr>
-        <w:tc>
-          <w:tcPr>
-            <w:tcW w:type="dxa" w:w="2000"/>
-            <w:tcBorders>
-              <w:top w:val="single" w:color="CCCCCC" w:sz="1"/>
-              <w:left w:val="single" w:color="CCCCCC" w:sz="1"/>
-              <w:bottom w:val="single" w:color="CCCCCC" w:sz="1"/>
-              <w:right w:val="single" w:color="CCCCCC" w:sz="1"/>
-            </w:tcBorders>
-            <w:shd w:fill="F8F9FA" w:val="clear"/>
-            <w:tcMar>
-              <w:top w:type="dxa" w:w="80"/>
-              <w:left w:type="dxa" w:w="120"/>
-              <w:bottom w:type="dxa" w:w="80"/>
-              <w:right w:type="dxa" w:w="120"/>
-            </w:tcMar>
-            <w:vAlign w:val="center"/>
-          </w:tcPr>
-          <w:p>
-            <w:r>
-              <w:rPr>
-                <w:b w:val="false"/>
-                <w:bCs w:val="false"/>
-                <w:sz w:val="18"/>
-                <w:szCs w:val="18"/>
-              </w:rPr>
-              <w:t xml:space="preserve">23/06/2026</w:t>
-            </w:r>
-          </w:p>
-        </w:tc>
-        <w:tc>
-          <w:tcPr>
-            <w:tcW w:type="dxa" w:w="1800"/>
-            <w:tcBorders>
-              <w:top w:val="single" w:color="CCCCCC" w:sz="1"/>
-              <w:left w:val="single" w:color="CCCCCC" w:sz="1"/>
-              <w:bottom w:val="single" w:color="CCCCCC" w:sz="1"/>
-              <w:right w:val="single" w:color="CCCCCC" w:sz="1"/>
-            </w:tcBorders>
-            <w:tcMar>
-              <w:top w:type="dxa" w:w="80"/>
-              <w:left w:type="dxa" w:w="120"/>
-              <w:bottom w:type="dxa" w:w="80"/>
-              <w:right w:type="dxa" w:w="120"/>
-            </w:tcMar>
-            <w:vAlign w:val="center"/>
-          </w:tcPr>
-          <w:p>
-            <w:r>
-              <w:rPr>
-                <w:b w:val="false"/>
-                <w:bCs w:val="false"/>
-                <w:sz w:val="18"/>
-                <w:szCs w:val="18"/>
-              </w:rPr>
-              <w:t xml:space="preserve">—</w:t>
-            </w:r>
-          </w:p>
-        </w:tc>
-        <w:tc>
-          <w:tcPr>
-            <w:tcW w:type="dxa" w:w="5920"/>
-            <w:tcBorders>
-              <w:top w:val="single" w:color="CCCCCC" w:sz="1"/>
-              <w:left w:val="single" w:color="CCCCCC" w:sz="1"/>
-              <w:bottom w:val="single" w:color="CCCCCC" w:sz="1"/>
-              <w:right w:val="single" w:color="CCCCCC" w:sz="1"/>
-            </w:tcBorders>
-            <w:tcMar>
-              <w:top w:type="dxa" w:w="80"/>
-              <w:left w:type="dxa" w:w="120"/>
-              <w:bottom w:type="dxa" w:w="80"/>
-              <w:right w:type="dxa" w:w="120"/>
-            </w:tcMar>
-            <w:vAlign w:val="center"/>
-          </w:tcPr>
-          <w:p>
-            <w:r>
-              <w:rPr>
-                <w:b w:val="false"/>
-                <w:bCs w:val="false"/>
-                <w:sz w:val="18"/>
-                <w:szCs w:val="18"/>
-              </w:rPr>
-              <w:t xml:space="preserve">Cumpleaños Euge (anual)</w:t>
-            </w:r>
-          </w:p>
-        </w:tc>
-      </w:tr>
-      <w:tr>
-        <w:tc>
-          <w:tcPr>
-            <w:tcW w:type="dxa" w:w="2000"/>
-            <w:tcBorders>
-              <w:top w:val="single" w:color="CCCCCC" w:sz="1"/>
-              <w:left w:val="single" w:color="CCCCCC" w:sz="1"/>
-              <w:bottom w:val="single" w:color="CCCCCC" w:sz="1"/>
-              <w:right w:val="single" w:color="CCCCCC" w:sz="1"/>
-            </w:tcBorders>
-            <w:shd w:fill="FEF9C3" w:val="clear"/>
-            <w:tcMar>
-              <w:top w:type="dxa" w:w="80"/>
-              <w:left w:type="dxa" w:w="120"/>
-              <w:bottom w:type="dxa" w:w="80"/>
-              <w:right w:type="dxa" w:w="120"/>
-            </w:tcMar>
-            <w:vAlign w:val="center"/>
-          </w:tcPr>
-          <w:p>
-            <w:r>
-              <w:t xml:space="preserve">27/06/2026</w:t>
-            </w:r>
-          </w:p>
-        </w:tc>
-        <w:tc>
-          <w:tcPr>
-            <w:tcW w:type="dxa" w:w="1800"/>
-            <w:tcBorders>
-              <w:top w:val="single" w:color="CCCCCC" w:sz="1"/>
-              <w:left w:val="single" w:color="CCCCCC" w:sz="1"/>
-              <w:bottom w:val="single" w:color="CCCCCC" w:sz="1"/>
-              <w:right w:val="single" w:color="CCCCCC" w:sz="1"/>
-            </w:tcBorders>
-            <w:tcMar>
-              <w:top w:type="dxa" w:w="80"/>
-              <w:left w:type="dxa" w:w="120"/>
-              <w:bottom w:type="dxa" w:w="80"/>
-              <w:right w:type="dxa" w:w="120"/>
-            </w:tcMar>
-            <w:vAlign w:val="center"/>
-          </w:tcPr>
-          <w:p>
-            <w:r>
-              <w:t xml:space="preserve">—</w:t>
-            </w:r>
-          </w:p>
-        </w:tc>
-        <w:tc>
-          <w:tcPr>
-            <w:tcW w:type="dxa" w:w="5920"/>
-            <w:tcBorders>
-              <w:top w:val="single" w:color="CCCCCC" w:sz="1"/>
-              <w:left w:val="single" w:color="CCCCCC" w:sz="1"/>
-              <w:bottom w:val="single" w:color="CCCCCC" w:sz="1"/>
-              <w:right w:val="single" w:color="CCCCCC" w:sz="1"/>
-            </w:tcBorders>
-            <w:tcMar>
-              <w:top w:type="dxa" w:w="80"/>
-              <w:left w:type="dxa" w:w="120"/>
-              <w:bottom w:type="dxa" w:w="80"/>
-              <w:right w:type="dxa" w:w="120"/>
-            </w:tcMar>
-            <w:vAlign w:val="center"/>
-          </w:tcPr>
-          <w:p>
-            <w:r>
-              <w:t xml:space="preserve">✅ SAProCEA — Documentación enviada y recibida el 05/05/2026. Vencimiento de matrícula: 27/06/2026 (365 días desde emisión del certificado). Pendiente: certificado + acceso al grupo de matriculados.</w:t>
+              <w:t xml:space="preserve">✅ SAProCEA — Matriculado desde el 07/05/2026. Certificado recibido (PDF con QR). Vencimiento anual de matrícula: 27/06/2026. Acceso al grupo de matriculados: pendiente confirmación.</w:t>
             </w:r>
           </w:p>
         </w:tc>
@@ -7142,7 +6962,7 @@
           <w:sz w:val="20"/>
           <w:szCs w:val="20"/>
         </w:rPr>
-        <w:t xml:space="preserve">Preparación para 2ª reunión con José (director de tesis) — 11/05 a las 17:00</w:t>
+        <w:t xml:space="preserve">Próxima reunión con José: a coordinar</w:t>
       </w:r>
     </w:p>
     <w:p>
@@ -7286,482 +7106,6 @@
                 <w:szCs w:val="20"/>
               </w:rPr>
               <w:t xml:space="preserve">ESTADO</w:t>
-            </w:r>
-          </w:p>
-        </w:tc>
-      </w:tr>
-      <w:tr>
-        <w:tc>
-          <w:tcPr>
-            <w:tcW w:type="dxa" w:w="1600"/>
-            <w:tcBorders>
-              <w:top w:val="single" w:color="CCCCCC" w:sz="1"/>
-              <w:left w:val="single" w:color="CCCCCC" w:sz="1"/>
-              <w:bottom w:val="single" w:color="CCCCCC" w:sz="1"/>
-              <w:right w:val="single" w:color="CCCCCC" w:sz="1"/>
-            </w:tcBorders>
-            <w:shd w:fill="FEF9C3" w:val="clear"/>
-            <w:tcMar>
-              <w:top w:type="dxa" w:w="80"/>
-              <w:left w:type="dxa" w:w="120"/>
-              <w:bottom w:type="dxa" w:w="80"/>
-              <w:right w:type="dxa" w:w="120"/>
-            </w:tcMar>
-            <w:vAlign w:val="center"/>
-          </w:tcPr>
-          <w:p>
-            <w:r>
-              <w:rPr>
-                <w:b w:val="false"/>
-                <w:bCs w:val="false"/>
-                <w:sz w:val="18"/>
-                <w:szCs w:val="18"/>
-              </w:rPr>
-              <w:t xml:space="preserve">29/04/2026</w:t>
-            </w:r>
-          </w:p>
-        </w:tc>
-        <w:tc>
-          <w:tcPr>
-            <w:tcW w:type="dxa" w:w="4520"/>
-            <w:tcBorders>
-              <w:top w:val="single" w:color="CCCCCC" w:sz="1"/>
-              <w:left w:val="single" w:color="CCCCCC" w:sz="1"/>
-              <w:bottom w:val="single" w:color="CCCCCC" w:sz="1"/>
-              <w:right w:val="single" w:color="CCCCCC" w:sz="1"/>
-            </w:tcBorders>
-            <w:tcMar>
-              <w:top w:type="dxa" w:w="80"/>
-              <w:left w:type="dxa" w:w="120"/>
-              <w:bottom w:type="dxa" w:w="80"/>
-              <w:right w:type="dxa" w:w="120"/>
-            </w:tcMar>
-            <w:vAlign w:val="center"/>
-          </w:tcPr>
-          <w:p>
-            <w:r>
-              <w:rPr>
-                <w:b w:val="false"/>
-                <w:bCs w:val="false"/>
-                <w:sz w:val="18"/>
-                <w:szCs w:val="18"/>
-              </w:rPr>
-              <w:t>Datos censo bovino por partido de Buenos Aires. SENASA 2021: ~20.1M cabezas, 135 partidos, 8 categorías (vacas, vaquillonas, novillos, novillitos, terneros/as, toros). CNA 2018 incluido como referencia histórica. Variación % calculada por partido.</w:t>
-            </w:r>
-          </w:p>
-        </w:tc>
-        <w:tc>
-          <w:tcPr>
-            <w:tcW w:type="dxa" w:w="2000"/>
-            <w:tcBorders>
-              <w:top w:val="single" w:color="CCCCCC" w:sz="1"/>
-              <w:left w:val="single" w:color="CCCCCC" w:sz="1"/>
-              <w:bottom w:val="single" w:color="CCCCCC" w:sz="1"/>
-              <w:right w:val="single" w:color="CCCCCC" w:sz="1"/>
-            </w:tcBorders>
-            <w:tcMar>
-              <w:top w:type="dxa" w:w="80"/>
-              <w:left w:type="dxa" w:w="120"/>
-              <w:bottom w:type="dxa" w:w="80"/>
-              <w:right w:type="dxa" w:w="120"/>
-            </w:tcMar>
-            <w:vAlign w:val="center"/>
-          </w:tcPr>
-          <w:p>
-            <w:r>
-              <w:rPr>
-                <w:b w:val="false"/>
-                <w:bCs w:val="false"/>
-                <w:sz w:val="18"/>
-                <w:szCs w:val="18"/>
-              </w:rPr>
-              <w:t>SENASA 2021 ✓ | INDEC CNA 2018 ✓</w:t>
-            </w:r>
-          </w:p>
-        </w:tc>
-        <w:tc>
-          <w:tcPr>
-            <w:tcW w:type="dxa" w:w="1600"/>
-            <w:tcBorders>
-              <w:top w:val="single" w:color="CCCCCC" w:sz="1"/>
-              <w:left w:val="single" w:color="CCCCCC" w:sz="1"/>
-              <w:bottom w:val="single" w:color="CCCCCC" w:sz="1"/>
-              <w:right w:val="single" w:color="CCCCCC" w:sz="1"/>
-            </w:tcBorders>
-            <w:tcMar>
-              <w:top w:type="dxa" w:w="80"/>
-              <w:left w:type="dxa" w:w="120"/>
-              <w:bottom w:type="dxa" w:w="80"/>
-              <w:right w:type="dxa" w:w="120"/>
-            </w:tcMar>
-            <w:vAlign w:val="center"/>
-          </w:tcPr>
-          <w:p>
-            <w:r>
-              <w:rPr>
-                <w:b w:val="false"/>
-                <w:bCs w:val="false"/>
-                <w:sz w:val="18"/>
-                <w:szCs w:val="18"/>
-              </w:rPr>
-              <w:t>✅ Completado</w:t>
-            </w:r>
-          </w:p>
-        </w:tc>
-      </w:tr>
-      <w:tr>
-        <w:tc>
-          <w:tcPr>
-            <w:tcW w:type="dxa" w:w="1600"/>
-            <w:tcBorders>
-              <w:top w:val="single" w:color="CCCCCC" w:sz="1"/>
-              <w:left w:val="single" w:color="CCCCCC" w:sz="1"/>
-              <w:bottom w:val="single" w:color="CCCCCC" w:sz="1"/>
-              <w:right w:val="single" w:color="CCCCCC" w:sz="1"/>
-            </w:tcBorders>
-            <w:shd w:fill="FEF9C3" w:val="clear"/>
-            <w:tcMar>
-              <w:top w:type="dxa" w:w="80"/>
-              <w:left w:type="dxa" w:w="120"/>
-              <w:bottom w:type="dxa" w:w="80"/>
-              <w:right w:type="dxa" w:w="120"/>
-            </w:tcMar>
-            <w:vAlign w:val="center"/>
-          </w:tcPr>
-          <w:p>
-            <w:r>
-              <w:rPr>
-                <w:b w:val="false"/>
-                <w:bCs w:val="false"/>
-                <w:sz w:val="18"/>
-                <w:szCs w:val="18"/>
-              </w:rPr>
-              <w:t xml:space="preserve">04/05/2026</w:t>
-            </w:r>
-          </w:p>
-        </w:tc>
-        <w:tc>
-          <w:tcPr>
-            <w:tcW w:type="dxa" w:w="4520"/>
-            <w:tcBorders>
-              <w:top w:val="single" w:color="CCCCCC" w:sz="1"/>
-              <w:left w:val="single" w:color="CCCCCC" w:sz="1"/>
-              <w:bottom w:val="single" w:color="CCCCCC" w:sz="1"/>
-              <w:right w:val="single" w:color="CCCCCC" w:sz="1"/>
-            </w:tcBorders>
-            <w:tcMar>
-              <w:top w:type="dxa" w:w="80"/>
-              <w:left w:type="dxa" w:w="120"/>
-              <w:bottom w:type="dxa" w:w="80"/>
-              <w:right w:type="dxa" w:w="120"/>
-            </w:tcMar>
-            <w:vAlign w:val="center"/>
-          </w:tcPr>
-          <w:p>
-            <w:r>
-              <w:rPr>
-                <w:b w:val="false"/>
-                <w:bCs w:val="false"/>
-                <w:sz w:val="18"/>
-                <w:szCs w:val="18"/>
-              </w:rPr>
-              <w:t>Estaciones SMN identificadas: 28 estaciones en zona pampeana bonaerense. Cada partido tiene asignada su estación más cercana con distancia (km). 103/137 partidos tienen T° y precipitación completas (75%). 34 partidos sin datos climáticos por falta de publicación en 11 estaciones (Pigüé, Las Flores, Lincoln, Olavarría, Tres Arroyos, etc.). ⚠ Olavarría (714K cab) y Lincoln (459K cab) son los partidos más críticos sin datos — consultar con José si usar estación alternativa o solicitud formal al SMN.</w:t>
-            </w:r>
-          </w:p>
-        </w:tc>
-        <w:tc>
-          <w:tcPr>
-            <w:tcW w:type="dxa" w:w="2000"/>
-            <w:tcBorders>
-              <w:top w:val="single" w:color="CCCCCC" w:sz="1"/>
-              <w:left w:val="single" w:color="CCCCCC" w:sz="1"/>
-              <w:bottom w:val="single" w:color="CCCCCC" w:sz="1"/>
-              <w:right w:val="single" w:color="CCCCCC" w:sz="1"/>
-            </w:tcBorders>
-            <w:tcMar>
-              <w:top w:type="dxa" w:w="80"/>
-              <w:left w:type="dxa" w:w="120"/>
-              <w:bottom w:type="dxa" w:w="80"/>
-              <w:right w:type="dxa" w:w="120"/>
-            </w:tcMar>
-            <w:vAlign w:val="center"/>
-          </w:tcPr>
-          <w:p>
-            <w:r>
-              <w:rPr>
-                <w:b w:val="false"/>
-                <w:bCs w:val="false"/>
-                <w:sz w:val="18"/>
-                <w:szCs w:val="18"/>
-              </w:rPr>
-              <w:t>smn.gob.ar ✓ | Normales 1981–2010 (17/28 con datos)</w:t>
-            </w:r>
-          </w:p>
-        </w:tc>
-        <w:tc>
-          <w:tcPr>
-            <w:tcW w:type="dxa" w:w="1600"/>
-            <w:tcBorders>
-              <w:top w:val="single" w:color="CCCCCC" w:sz="1"/>
-              <w:left w:val="single" w:color="CCCCCC" w:sz="1"/>
-              <w:bottom w:val="single" w:color="CCCCCC" w:sz="1"/>
-              <w:right w:val="single" w:color="CCCCCC" w:sz="1"/>
-            </w:tcBorders>
-            <w:tcMar>
-              <w:top w:type="dxa" w:w="80"/>
-              <w:left w:type="dxa" w:w="120"/>
-              <w:bottom w:type="dxa" w:w="80"/>
-              <w:right w:type="dxa" w:w="120"/>
-            </w:tcMar>
-            <w:vAlign w:val="center"/>
-          </w:tcPr>
-          <w:p>
-            <w:r>
-              <w:rPr>
-                <w:b w:val="false"/>
-                <w:bCs w:val="false"/>
-                <w:sz w:val="18"/>
-                <w:szCs w:val="18"/>
-              </w:rPr>
-              <w:t>⚠ Completado c/ gaps</w:t>
-            </w:r>
-          </w:p>
-        </w:tc>
-      </w:tr>
-      <w:tr>
-        <w:tc>
-          <w:tcPr>
-            <w:tcW w:type="dxa" w:w="1600"/>
-            <w:tcBorders>
-              <w:top w:val="single" w:color="CCCCCC" w:sz="1"/>
-              <w:left w:val="single" w:color="CCCCCC" w:sz="1"/>
-              <w:bottom w:val="single" w:color="CCCCCC" w:sz="1"/>
-              <w:right w:val="single" w:color="CCCCCC" w:sz="1"/>
-            </w:tcBorders>
-            <w:shd w:fill="FEF9C3" w:val="clear"/>
-            <w:tcMar>
-              <w:top w:type="dxa" w:w="80"/>
-              <w:left w:type="dxa" w:w="120"/>
-              <w:bottom w:type="dxa" w:w="80"/>
-              <w:right w:type="dxa" w:w="120"/>
-            </w:tcMar>
-            <w:vAlign w:val="center"/>
-          </w:tcPr>
-          <w:p>
-            <w:r>
-              <w:rPr>
-                <w:b w:val="false"/>
-                <w:bCs w:val="false"/>
-                <w:sz w:val="18"/>
-                <w:szCs w:val="18"/>
-              </w:rPr>
-              <w:t xml:space="preserve">07/05/2026</w:t>
-            </w:r>
-          </w:p>
-        </w:tc>
-        <w:tc>
-          <w:tcPr>
-            <w:tcW w:type="dxa" w:w="4520"/>
-            <w:tcBorders>
-              <w:top w:val="single" w:color="CCCCCC" w:sz="1"/>
-              <w:left w:val="single" w:color="CCCCCC" w:sz="1"/>
-              <w:bottom w:val="single" w:color="CCCCCC" w:sz="1"/>
-              <w:right w:val="single" w:color="CCCCCC" w:sz="1"/>
-            </w:tcBorders>
-            <w:tcMar>
-              <w:top w:type="dxa" w:w="80"/>
-              <w:left w:type="dxa" w:w="120"/>
-              <w:bottom w:type="dxa" w:w="80"/>
-              <w:right w:type="dxa" w:w="120"/>
-            </w:tcMar>
-            <w:vAlign w:val="center"/>
-          </w:tcPr>
-          <w:p>
-            <w:r>
-              <w:rPr>
-                <w:b w:val="false"/>
-                <w:bCs w:val="false"/>
-                <w:sz w:val="18"/>
-                <w:szCs w:val="18"/>
-              </w:rPr>
-              <w:t>Plantilla de Emisiones (IPCC Tier 2) creada: filas = 135 partidos, columnas = Total bovinos + Vacas (SENASA 2021) + Estación SMN + Distancia + T° media + Precipitación + Factor CH₄ (a cargar) + Emisiones CH₄ (t/año) + CO₂eq (t/año) + Superficie (km²) + Densidad (cab/km²). Estructura lista para completar con el factor de emisión que confirme José.</w:t>
-            </w:r>
-          </w:p>
-        </w:tc>
-        <w:tc>
-          <w:tcPr>
-            <w:tcW w:type="dxa" w:w="2000"/>
-            <w:tcBorders>
-              <w:top w:val="single" w:color="CCCCCC" w:sz="1"/>
-              <w:left w:val="single" w:color="CCCCCC" w:sz="1"/>
-              <w:bottom w:val="single" w:color="CCCCCC" w:sz="1"/>
-              <w:right w:val="single" w:color="CCCCCC" w:sz="1"/>
-            </w:tcBorders>
-            <w:tcMar>
-              <w:top w:type="dxa" w:w="80"/>
-              <w:left w:type="dxa" w:w="120"/>
-              <w:bottom w:type="dxa" w:w="80"/>
-              <w:right w:type="dxa" w:w="120"/>
-            </w:tcMar>
-            <w:vAlign w:val="center"/>
-          </w:tcPr>
-          <w:p>
-            <w:r>
-              <w:rPr>
-                <w:b w:val="false"/>
-                <w:bCs w:val="false"/>
-                <w:sz w:val="18"/>
-                <w:szCs w:val="18"/>
-              </w:rPr>
-              <w:t>"Datos Bovinos Bs. As. Combinados.xlsx" ✓</w:t>
-            </w:r>
-          </w:p>
-        </w:tc>
-        <w:tc>
-          <w:tcPr>
-            <w:tcW w:type="dxa" w:w="1600"/>
-            <w:tcBorders>
-              <w:top w:val="single" w:color="CCCCCC" w:sz="1"/>
-              <w:left w:val="single" w:color="CCCCCC" w:sz="1"/>
-              <w:bottom w:val="single" w:color="CCCCCC" w:sz="1"/>
-              <w:right w:val="single" w:color="CCCCCC" w:sz="1"/>
-            </w:tcBorders>
-            <w:tcMar>
-              <w:top w:type="dxa" w:w="80"/>
-              <w:left w:type="dxa" w:w="120"/>
-              <w:bottom w:type="dxa" w:w="80"/>
-              <w:right w:type="dxa" w:w="120"/>
-            </w:tcMar>
-            <w:vAlign w:val="center"/>
-          </w:tcPr>
-          <w:p>
-            <w:r>
-              <w:rPr>
-                <w:b w:val="false"/>
-                <w:bCs w:val="false"/>
-                <w:sz w:val="18"/>
-                <w:szCs w:val="18"/>
-              </w:rPr>
-              <w:t>✅ Estructura lista</w:t>
-            </w:r>
-          </w:p>
-        </w:tc>
-      </w:tr>
-      <w:tr>
-        <w:tc>
-          <w:tcPr>
-            <w:tcW w:type="dxa" w:w="1600"/>
-            <w:tcBorders>
-              <w:top w:val="single" w:color="CCCCCC" w:sz="1"/>
-              <w:left w:val="single" w:color="CCCCCC" w:sz="1"/>
-              <w:bottom w:val="single" w:color="CCCCCC" w:sz="1"/>
-              <w:right w:val="single" w:color="CCCCCC" w:sz="1"/>
-            </w:tcBorders>
-            <w:shd w:fill="FADBD8" w:val="clear"/>
-            <w:tcMar>
-              <w:top w:type="dxa" w:w="80"/>
-              <w:left w:type="dxa" w:w="120"/>
-              <w:bottom w:type="dxa" w:w="80"/>
-              <w:right w:type="dxa" w:w="120"/>
-            </w:tcMar>
-            <w:vAlign w:val="center"/>
-          </w:tcPr>
-          <w:p>
-            <w:r>
-              <w:rPr>
-                <w:b w:val="false"/>
-                <w:bCs w:val="false"/>
-                <w:sz w:val="18"/>
-                <w:szCs w:val="18"/>
-              </w:rPr>
-              <w:t xml:space="preserve">08/05/2026</w:t>
-            </w:r>
-          </w:p>
-        </w:tc>
-        <w:tc>
-          <w:tcPr>
-            <w:tcW w:type="dxa" w:w="4520"/>
-            <w:tcBorders>
-              <w:top w:val="single" w:color="CCCCCC" w:sz="1"/>
-              <w:left w:val="single" w:color="CCCCCC" w:sz="1"/>
-              <w:bottom w:val="single" w:color="CCCCCC" w:sz="1"/>
-              <w:right w:val="single" w:color="CCCCCC" w:sz="1"/>
-            </w:tcBorders>
-            <w:tcMar>
-              <w:top w:type="dxa" w:w="80"/>
-              <w:left w:type="dxa" w:w="120"/>
-              <w:bottom w:type="dxa" w:w="80"/>
-              <w:right w:type="dxa" w:w="120"/>
-            </w:tcMar>
-            <w:vAlign w:val="center"/>
-          </w:tcPr>
-          <w:p>
-            <w:r>
-              <w:rPr>
-                <w:b w:val="false"/>
-                <w:bCs w:val="false"/>
-                <w:sz w:val="18"/>
-                <w:szCs w:val="18"/>
-              </w:rPr>
-              <w:t>✅ RESUELTO: José confirmó Tier 2 ("usamos datos medidos"). Pendiente aún: criterio para los 34 partidos sin datos SMN (Olavarría, Lincoln, etc.) — preguntar el 11/05. Nueva pregunta para el 11/05: pedir tabla de pesos vivos y digestibilidad por categoría animal (fuente INTA/SENASA).</w:t>
-            </w:r>
-          </w:p>
-        </w:tc>
-        <w:tc>
-          <w:tcPr>
-            <w:tcW w:type="dxa" w:w="2000"/>
-            <w:tcBorders>
-              <w:top w:val="single" w:color="CCCCCC" w:sz="1"/>
-              <w:left w:val="single" w:color="CCCCCC" w:sz="1"/>
-              <w:bottom w:val="single" w:color="CCCCCC" w:sz="1"/>
-              <w:right w:val="single" w:color="CCCCCC" w:sz="1"/>
-            </w:tcBorders>
-            <w:tcMar>
-              <w:top w:type="dxa" w:w="80"/>
-              <w:left w:type="dxa" w:w="120"/>
-              <w:bottom w:type="dxa" w:w="80"/>
-              <w:right w:type="dxa" w:w="120"/>
-            </w:tcMar>
-            <w:vAlign w:val="center"/>
-          </w:tcPr>
-          <w:p>
-            <w:r>
-              <w:rPr>
-                <w:b w:val="false"/>
-                <w:bCs w:val="false"/>
-                <w:sz w:val="18"/>
-                <w:szCs w:val="18"/>
-              </w:rPr>
-              <w:t xml:space="preserve">Guías IPCC</w:t>
-            </w:r>
-          </w:p>
-        </w:tc>
-        <w:tc>
-          <w:tcPr>
-            <w:tcW w:type="dxa" w:w="1600"/>
-            <w:tcBorders>
-              <w:top w:val="single" w:color="CCCCCC" w:sz="1"/>
-              <w:left w:val="single" w:color="CCCCCC" w:sz="1"/>
-              <w:bottom w:val="single" w:color="CCCCCC" w:sz="1"/>
-              <w:right w:val="single" w:color="CCCCCC" w:sz="1"/>
-            </w:tcBorders>
-            <w:tcMar>
-              <w:top w:type="dxa" w:w="80"/>
-              <w:left w:type="dxa" w:w="120"/>
-              <w:bottom w:type="dxa" w:w="80"/>
-              <w:right w:type="dxa" w:w="120"/>
-            </w:tcMar>
-            <w:vAlign w:val="center"/>
-          </w:tcPr>
-          <w:p>
-            <w:r>
-              <w:rPr>
-                <w:b w:val="false"/>
-                <w:bCs w:val="false"/>
-                <w:sz w:val="18"/>
-                <w:szCs w:val="18"/>
-              </w:rPr>
-              <w:t>Pendiente — reunión 11/05</w:t>
             </w:r>
           </w:p>
         </w:tc>
@@ -12677,7 +12021,7 @@
                 <w:sz w:val="18"/>
                 <w:szCs w:val="18"/>
               </w:rPr>
-              <w:t xml:space="preserve">06/05/2026 (próxima)</w:t>
+              <w:t xml:space="preserve">03/06/2026 (próxima)</w:t>
             </w:r>
           </w:p>
         </w:tc>
@@ -14711,6 +14055,65 @@
           <w:p>
             <w:r>
               <w:t>Protocolo Actual — 6 cambios. 1) SAProCEA: documentación enviada y recibida confirmada (05/05/2026) — estado actualizado de “urgente enviar” a “en proceso, esperando certificado”. 2) Evento 🎓 Acto de Colación (20/05/2026, 14:00–21:00hs) agregado a Próximos Eventos. 3) Tomografía dental: el usuario confirmó que ya fue realizada — eliminada del calendario (20/05) y actualizadas las entradas del dentista (21/05), tabla de Salud e Implante de muela. 4) Parcial de Climatología (~03-04/05) eliminado (ya pasó). 5) Deadline SAProCEA 27/06 actualizado: ya no es vencimiento de envío de docs (enviadas), sino referencia de vencimiento de matrícula. 6) Fecha de última actualización al 05/05/2026.</w:t>
+            </w:r>
+          </w:p>
+        </w:tc>
+      </w:tr>
+      <w:tr>
+        <w:tc>
+          <w:tcPr>
+            <w:tcW w:type="dxa" w:w="1500"/>
+            <w:tcBorders>
+              <w:top w:val="single" w:color="CCCCCC" w:sz="1"/>
+              <w:left w:val="single" w:color="CCCCCC" w:sz="1"/>
+              <w:bottom w:val="single" w:color="CCCCCC" w:sz="1"/>
+              <w:right w:val="single" w:color="CCCCCC" w:sz="1"/>
+            </w:tcBorders>
+            <w:shd w:fill="F8F9FA" w:val="clear"/>
+            <w:tcMar>
+              <w:top w:type="dxa" w:w="80"/>
+              <w:left w:type="dxa" w:w="120"/>
+              <w:bottom w:type="dxa" w:w="80"/>
+              <w:right w:type="dxa" w:w="120"/>
+            </w:tcMar>
+            <w:vAlign w:val="center"/>
+          </w:tcPr>
+          <w:p>
+            <w:r>
+              <w:rPr>
+                <w:b/>
+                <w:bCs/>
+                <w:sz w:val="18"/>
+                <w:szCs w:val="18"/>
+              </w:rPr>
+              <w:t xml:space="preserve">09/05/2026</w:t>
+            </w:r>
+          </w:p>
+        </w:tc>
+        <w:tc>
+          <w:tcPr>
+            <w:tcW w:type="dxa" w:w="8220"/>
+            <w:tcBorders>
+              <w:top w:val="single" w:color="CCCCCC" w:sz="1"/>
+              <w:left w:val="single" w:color="CCCCCC" w:sz="1"/>
+              <w:bottom w:val="single" w:color="CCCCCC" w:sz="1"/>
+              <w:right w:val="single" w:color="CCCCCC" w:sz="1"/>
+            </w:tcBorders>
+            <w:tcMar>
+              <w:top w:type="dxa" w:w="80"/>
+              <w:left w:type="dxa" w:w="120"/>
+              <w:bottom w:type="dxa" w:w="80"/>
+              <w:right w:type="dxa" w:w="120"/>
+            </w:tcMar>
+            <w:vAlign w:val="center"/>
+          </w:tcPr>
+          <w:p>
+            <w:r>
+              <w:rPr>
+                <w:sz w:val="18"/>
+                <w:szCs w:val="18"/>
+              </w:rPr>
+              <w:t>Protocolo Actual — 5 cambios aprobados. 1) SAProCEA: estado actualizado a “✅ Matriculado” — certificado recibido el 07/05/2026. 2) Dr. Balasus (Harvard): dataset TROPOMI+GOSAT autorizado — pendiente cerrado. 3) Evento agregado: Striping + Baño Chet (mié 13/05, 17:00–18:00 hs). 4) Limpieza automática: filas Nutricionista 06/05 y Cumpleaños Novios 08/05 eliminadas; Nutricionista próxima actualizada a 03/06/2026. 5) Tabla Tesis: filas completadas de 29/04, 04/05, 07/05 y 08/05 eliminadas — solo queda el pendiente del 10/05.</w:t>
             </w:r>
           </w:p>
         </w:tc>

</xml_diff>

<commit_message>
Protocolo Actual 19/05/2026 ΓÇö 6 cambios: limpieza eventos pasados, Parcial Climatologia realizado, Dental System agregado, Balasus autorizado, primer lead EA, boletin SAProCEA
</commit_message>
<xml_diff>
--- a/Agenda Personal - Maximiliano Marcellini.docx
+++ b/Agenda Personal - Maximiliano Marcellini.docx
@@ -75,7 +75,7 @@
           <w:sz w:val="18"/>
           <w:szCs w:val="18"/>
         </w:rPr>
-        <w:t>Última actualización: 13 de mayo de 2026</w:t>
+        <w:t>Última actualización: 19 de mayo de 2026</w:t>
       </w:r>
     </w:p>
     <w:p>
@@ -1470,6 +1470,9 @@
               </w:rPr>
               <w:t>✅ Copernicus/Sentinel-5P TROPOMI: COMPLETADO — 5.395 archivos procesados, 470 recortes exitosos sobre la región pampeana bonaerense. | ✅ Dataset Blended TROPOMI+GOSAT (Balasus et al., 2023, Harvard): AUTORIZADO — Dr. Balasus confirmó el 06/05/2026: “That citation is sufficient.” Dataset disponible para uso en la tesis.</w:t>
             </w:r>
+            <w:r>
+              <w:t xml:space="preserve"> ✅ Dr. Balasus (Harvard) autorizó uso del dataset TROPOMI+GOSAT el 06/05/2026: 'That citation is sufficient.'</w:t>
+            </w:r>
           </w:p>
         </w:tc>
       </w:tr>
@@ -1950,7 +1953,7 @@
                 <w:sz w:val="18"/>
                 <w:szCs w:val="18"/>
               </w:rPr>
-              <w:t xml:space="preserve">Parcial Climatología — fecha confirmada</w:t>
+              <w:t>✅ Parcial Climatología — REALIZADO</w:t>
             </w:r>
           </w:p>
         </w:tc>
@@ -1979,7 +1982,7 @@
                 <w:sz w:val="18"/>
                 <w:szCs w:val="18"/>
               </w:rPr>
-              <w:t xml:space="preserve">Alta</w:t>
+              <w:t>✅ Completado</w:t>
             </w:r>
           </w:p>
         </w:tc>
@@ -2008,7 +2011,7 @@
                 <w:sz w:val="18"/>
                 <w:szCs w:val="18"/>
               </w:rPr>
-              <w:t xml:space="preserve">19/05/2026 — CONFIRMADO.</w:t>
+              <w:t>✅ Parcial realizado el 19/05/2026.</w:t>
             </w:r>
           </w:p>
         </w:tc>
@@ -2555,24 +2558,24 @@
               <w:bottom w:val="single" w:color="CCCCCC" w:sz="1"/>
               <w:right w:val="single" w:color="CCCCCC" w:sz="1"/>
             </w:tcBorders>
-            <w:shd w:fill="F8F9FA" w:val="clear"/>
-            <w:tcMar>
-              <w:top w:type="dxa" w:w="80"/>
-              <w:left w:type="dxa" w:w="120"/>
-              <w:bottom w:type="dxa" w:w="80"/>
-              <w:right w:type="dxa" w:w="120"/>
-            </w:tcMar>
-            <w:vAlign w:val="center"/>
-          </w:tcPr>
-          <w:p>
-            <w:r>
-              <w:rPr>
-                <w:b w:val="false"/>
-                <w:bCs w:val="false"/>
-                <w:sz w:val="18"/>
-                <w:szCs w:val="18"/>
-              </w:rPr>
-              <w:t xml:space="preserve">13/05/2026</w:t>
+            <w:shd w:fill="1F3864" w:val="clear"/>
+            <w:tcMar>
+              <w:top w:type="dxa" w:w="80"/>
+              <w:left w:type="dxa" w:w="120"/>
+              <w:bottom w:type="dxa" w:w="80"/>
+              <w:right w:type="dxa" w:w="120"/>
+            </w:tcMar>
+            <w:vAlign w:val="center"/>
+          </w:tcPr>
+          <w:p>
+            <w:r>
+              <w:rPr>
+                <w:b/>
+                <w:bCs/>
+                <w:sz w:val="20"/>
+                <w:szCs w:val="20"/>
+              </w:rPr>
+              <w:t xml:space="preserve">20/05/2026</w:t>
             </w:r>
           </w:p>
         </w:tc>
@@ -2585,23 +2588,24 @@
               <w:bottom w:val="single" w:color="CCCCCC" w:sz="1"/>
               <w:right w:val="single" w:color="CCCCCC" w:sz="1"/>
             </w:tcBorders>
-            <w:tcMar>
-              <w:top w:type="dxa" w:w="80"/>
-              <w:left w:type="dxa" w:w="120"/>
-              <w:bottom w:type="dxa" w:w="80"/>
-              <w:right w:type="dxa" w:w="120"/>
-            </w:tcMar>
-            <w:vAlign w:val="center"/>
-          </w:tcPr>
-          <w:p>
-            <w:r>
-              <w:rPr>
-                <w:b w:val="false"/>
-                <w:bCs w:val="false"/>
-                <w:sz w:val="18"/>
-                <w:szCs w:val="18"/>
-              </w:rPr>
-              <w:t xml:space="preserve">17:00–18:00 hs</w:t>
+            <w:shd w:fill="1F3864" w:val="clear"/>
+            <w:tcMar>
+              <w:top w:type="dxa" w:w="80"/>
+              <w:left w:type="dxa" w:w="120"/>
+              <w:bottom w:type="dxa" w:w="80"/>
+              <w:right w:type="dxa" w:w="120"/>
+            </w:tcMar>
+            <w:vAlign w:val="center"/>
+          </w:tcPr>
+          <w:p>
+            <w:r>
+              <w:rPr>
+                <w:b/>
+                <w:bCs/>
+                <w:sz w:val="20"/>
+                <w:szCs w:val="20"/>
+              </w:rPr>
+              <w:t xml:space="preserve">13:00–14:00 hs</w:t>
             </w:r>
           </w:p>
         </w:tc>
@@ -2614,202 +2618,24 @@
               <w:bottom w:val="single" w:color="CCCCCC" w:sz="1"/>
               <w:right w:val="single" w:color="CCCCCC" w:sz="1"/>
             </w:tcBorders>
-            <w:tcMar>
-              <w:top w:type="dxa" w:w="80"/>
-              <w:left w:type="dxa" w:w="120"/>
-              <w:bottom w:type="dxa" w:w="80"/>
-              <w:right w:type="dxa" w:w="120"/>
-            </w:tcMar>
-            <w:vAlign w:val="center"/>
-          </w:tcPr>
-          <w:p>
-            <w:r>
-              <w:rPr>
-                <w:b w:val="false"/>
-                <w:bCs w:val="false"/>
-                <w:sz w:val="18"/>
-                <w:szCs w:val="18"/>
-              </w:rPr>
-              <w:t xml:space="preserve">Striping + Baño Chet — Cap. Gral. Ramón Freire 2401</w:t>
-            </w:r>
-          </w:p>
-        </w:tc>
-      </w:tr>
-      <w:tr>
-        <w:tc>
-          <w:tcPr>
-            <w:tcW w:type="dxa" w:w="2000"/>
-            <w:tcBorders>
-              <w:top w:val="single" w:color="CCCCCC" w:sz="1"/>
-              <w:left w:val="single" w:color="CCCCCC" w:sz="1"/>
-              <w:bottom w:val="single" w:color="CCCCCC" w:sz="1"/>
-              <w:right w:val="single" w:color="CCCCCC" w:sz="1"/>
-            </w:tcBorders>
-            <w:tcMar>
-              <w:top w:type="dxa" w:w="80"/>
-              <w:left w:type="dxa" w:w="120"/>
-              <w:bottom w:type="dxa" w:w="80"/>
-              <w:right w:type="dxa" w:w="120"/>
-            </w:tcMar>
-            <w:vAlign w:val="center"/>
-          </w:tcPr>
-          <w:p>
-            <w:r>
-              <w:rPr>
-                <w:b w:val="false"/>
-                <w:bCs w:val="false"/>
-                <w:sz w:val="18"/>
-                <w:szCs w:val="18"/>
-              </w:rPr>
-              <w:t>17/05/2026</w:t>
-            </w:r>
-          </w:p>
-        </w:tc>
-        <w:tc>
-          <w:tcPr>
-            <w:tcW w:type="dxa" w:w="1800"/>
-            <w:tcBorders>
-              <w:top w:val="single" w:color="CCCCCC" w:sz="1"/>
-              <w:left w:val="single" w:color="CCCCCC" w:sz="1"/>
-              <w:bottom w:val="single" w:color="CCCCCC" w:sz="1"/>
-              <w:right w:val="single" w:color="CCCCCC" w:sz="1"/>
-            </w:tcBorders>
-            <w:tcMar>
-              <w:top w:type="dxa" w:w="80"/>
-              <w:left w:type="dxa" w:w="120"/>
-              <w:bottom w:type="dxa" w:w="80"/>
-              <w:right w:type="dxa" w:w="120"/>
-            </w:tcMar>
-            <w:vAlign w:val="center"/>
-          </w:tcPr>
-          <w:p>
-            <w:r>
-              <w:rPr>
-                <w:b w:val="false"/>
-                <w:bCs w:val="false"/>
-                <w:sz w:val="18"/>
-                <w:szCs w:val="18"/>
-              </w:rPr>
-              <w:t>—</w:t>
-            </w:r>
-          </w:p>
-        </w:tc>
-        <w:tc>
-          <w:tcPr>
-            <w:tcW w:type="dxa" w:w="5920"/>
-            <w:tcBorders>
-              <w:top w:val="single" w:color="CCCCCC" w:sz="1"/>
-              <w:left w:val="single" w:color="CCCCCC" w:sz="1"/>
-              <w:bottom w:val="single" w:color="CCCCCC" w:sz="1"/>
-              <w:right w:val="single" w:color="CCCCCC" w:sz="1"/>
-            </w:tcBorders>
-            <w:tcMar>
-              <w:top w:type="dxa" w:w="80"/>
-              <w:left w:type="dxa" w:w="120"/>
-              <w:bottom w:type="dxa" w:w="80"/>
-              <w:right w:type="dxa" w:w="120"/>
-            </w:tcMar>
-            <w:vAlign w:val="center"/>
-          </w:tcPr>
-          <w:p>
-            <w:r>
-              <w:rPr>
-                <w:b w:val="false"/>
-                <w:bCs w:val="false"/>
-                <w:sz w:val="18"/>
-                <w:szCs w:val="18"/>
-              </w:rPr>
-              <w:t>🏃 Salida MB Running</w:t>
-            </w:r>
-          </w:p>
-        </w:tc>
-      </w:tr>
-      <w:tr>
-        <w:tc>
-          <w:tcPr>
-            <w:tcW w:type="dxa" w:w="2000"/>
-            <w:tcBorders>
-              <w:top w:val="single" w:color="CCCCCC" w:sz="1"/>
-              <w:left w:val="single" w:color="CCCCCC" w:sz="1"/>
-              <w:bottom w:val="single" w:color="CCCCCC" w:sz="1"/>
-              <w:right w:val="single" w:color="CCCCCC" w:sz="1"/>
-            </w:tcBorders>
-            <w:shd w:fill="D5F5E3" w:val="clear"/>
-            <w:tcMar>
-              <w:top w:type="dxa" w:w="80"/>
-              <w:left w:type="dxa" w:w="120"/>
-              <w:bottom w:type="dxa" w:w="80"/>
-              <w:right w:type="dxa" w:w="120"/>
-            </w:tcMar>
-            <w:vAlign w:val="center"/>
-          </w:tcPr>
-          <w:p>
-            <w:r>
-              <w:rPr>
-                <w:b w:val="false"/>
-                <w:bCs w:val="false"/>
-                <w:sz w:val="18"/>
-                <w:szCs w:val="18"/>
-              </w:rPr>
-              <w:t xml:space="preserve">18/05/2026</w:t>
-            </w:r>
-          </w:p>
-        </w:tc>
-        <w:tc>
-          <w:tcPr>
-            <w:tcW w:type="dxa" w:w="1800"/>
-            <w:tcBorders>
-              <w:top w:val="single" w:color="CCCCCC" w:sz="1"/>
-              <w:left w:val="single" w:color="CCCCCC" w:sz="1"/>
-              <w:bottom w:val="single" w:color="CCCCCC" w:sz="1"/>
-              <w:right w:val="single" w:color="CCCCCC" w:sz="1"/>
-            </w:tcBorders>
-            <w:tcMar>
-              <w:top w:type="dxa" w:w="80"/>
-              <w:left w:type="dxa" w:w="120"/>
-              <w:bottom w:type="dxa" w:w="80"/>
-              <w:right w:type="dxa" w:w="120"/>
-            </w:tcMar>
-            <w:vAlign w:val="center"/>
-          </w:tcPr>
-          <w:p>
-            <w:r>
-              <w:rPr>
-                <w:b w:val="false"/>
-                <w:bCs w:val="false"/>
-                <w:sz w:val="18"/>
-                <w:szCs w:val="18"/>
-              </w:rPr>
-              <w:t xml:space="preserve">16:30–17:30 hs</w:t>
-            </w:r>
-          </w:p>
-        </w:tc>
-        <w:tc>
-          <w:tcPr>
-            <w:tcW w:type="dxa" w:w="5920"/>
-            <w:tcBorders>
-              <w:top w:val="single" w:color="CCCCCC" w:sz="1"/>
-              <w:left w:val="single" w:color="CCCCCC" w:sz="1"/>
-              <w:bottom w:val="single" w:color="CCCCCC" w:sz="1"/>
-              <w:right w:val="single" w:color="CCCCCC" w:sz="1"/>
-            </w:tcBorders>
-            <w:tcMar>
-              <w:top w:type="dxa" w:w="80"/>
-              <w:left w:type="dxa" w:w="120"/>
-              <w:bottom w:type="dxa" w:w="80"/>
-              <w:right w:type="dxa" w:w="120"/>
-            </w:tcMar>
-            <w:vAlign w:val="center"/>
-          </w:tcPr>
-          <w:p>
-            <w:r>
-              <w:rPr>
-                <w:b w:val="false"/>
-                <w:bCs w:val="false"/>
-                <w:sz w:val="18"/>
-                <w:szCs w:val="18"/>
-              </w:rPr>
-              <w:t xml:space="preserve">Oftalmología — posible estudio previo al turno del 27/05</w:t>
+            <w:shd w:fill="1F3864" w:val="clear"/>
+            <w:tcMar>
+              <w:top w:type="dxa" w:w="80"/>
+              <w:left w:type="dxa" w:w="120"/>
+              <w:bottom w:type="dxa" w:w="80"/>
+              <w:right w:type="dxa" w:w="120"/>
+            </w:tcMar>
+            <w:vAlign w:val="center"/>
+          </w:tcPr>
+          <w:p>
+            <w:r>
+              <w:rPr>
+                <w:b/>
+                <w:bCs/>
+                <w:sz w:val="20"/>
+                <w:szCs w:val="20"/>
+              </w:rPr>
+              <w:t xml:space="preserve">Dental System — Talcahuano 1134, CABA</w:t>
             </w:r>
           </w:p>
         </w:tc>
@@ -6712,7 +6538,7 @@
           <w:sz w:val="20"/>
           <w:szCs w:val="20"/>
         </w:rPr>
-        <w:t xml:space="preserve">Blog: 19 artículos publicados. 7 recientes (2026) alineados al target. 12 viejos (2021-2022) a revisar/depurar.</w:t>
+        <w:t>Blog: 19 artículos publicados. 7 recientes (2026) alineados al target. 12 viejos (2021-2022) a revisar/depurar. 🟢 Primer lead orgánico vía guía de residuos: 17/05/2026.</w:t>
       </w:r>
     </w:p>
     <w:p>
@@ -7110,125 +6936,6 @@
           </w:p>
         </w:tc>
       </w:tr>
-      <w:tr>
-        <w:tc>
-          <w:tcPr>
-            <w:tcW w:type="dxa" w:w="1600"/>
-            <w:tcBorders>
-              <w:top w:val="single" w:color="CCCCCC" w:sz="1"/>
-              <w:left w:val="single" w:color="CCCCCC" w:sz="1"/>
-              <w:bottom w:val="single" w:color="CCCCCC" w:sz="1"/>
-              <w:right w:val="single" w:color="CCCCCC" w:sz="1"/>
-            </w:tcBorders>
-            <w:shd w:fill="FADBD8" w:val="clear"/>
-            <w:tcMar>
-              <w:top w:type="dxa" w:w="80"/>
-              <w:left w:type="dxa" w:w="120"/>
-              <w:bottom w:type="dxa" w:w="80"/>
-              <w:right w:type="dxa" w:w="120"/>
-            </w:tcMar>
-            <w:vAlign w:val="center"/>
-          </w:tcPr>
-          <w:p>
-            <w:r>
-              <w:rPr>
-                <w:b w:val="false"/>
-                <w:bCs w:val="false"/>
-                <w:sz w:val="18"/>
-                <w:szCs w:val="18"/>
-              </w:rPr>
-              <w:t xml:space="preserve">10/05/2026</w:t>
-            </w:r>
-          </w:p>
-        </w:tc>
-        <w:tc>
-          <w:tcPr>
-            <w:tcW w:type="dxa" w:w="4520"/>
-            <w:tcBorders>
-              <w:top w:val="single" w:color="CCCCCC" w:sz="1"/>
-              <w:left w:val="single" w:color="CCCCCC" w:sz="1"/>
-              <w:bottom w:val="single" w:color="CCCCCC" w:sz="1"/>
-              <w:right w:val="single" w:color="CCCCCC" w:sz="1"/>
-            </w:tcBorders>
-            <w:tcMar>
-              <w:top w:type="dxa" w:w="80"/>
-              <w:left w:type="dxa" w:w="120"/>
-              <w:bottom w:type="dxa" w:w="80"/>
-              <w:right w:type="dxa" w:w="120"/>
-            </w:tcMar>
-            <w:vAlign w:val="center"/>
-          </w:tcPr>
-          <w:p>
-            <w:r>
-              <w:rPr>
-                <w:b w:val="false"/>
-                <w:bCs w:val="false"/>
-                <w:sz w:val="18"/>
-                <w:szCs w:val="18"/>
-              </w:rPr>
-              <w:t>Revisión final: datos ✓, estaciones ✓ (con gaps a resolver), tabla ✓. Pendiente: factor de emisión + criterio para 34 partidos sin datos SMN + superficie por partido. Llegar al 11/05 con todo consolidado.</w:t>
-            </w:r>
-          </w:p>
-        </w:tc>
-        <w:tc>
-          <w:tcPr>
-            <w:tcW w:type="dxa" w:w="2000"/>
-            <w:tcBorders>
-              <w:top w:val="single" w:color="CCCCCC" w:sz="1"/>
-              <w:left w:val="single" w:color="CCCCCC" w:sz="1"/>
-              <w:bottom w:val="single" w:color="CCCCCC" w:sz="1"/>
-              <w:right w:val="single" w:color="CCCCCC" w:sz="1"/>
-            </w:tcBorders>
-            <w:tcMar>
-              <w:top w:type="dxa" w:w="80"/>
-              <w:left w:type="dxa" w:w="120"/>
-              <w:bottom w:type="dxa" w:w="80"/>
-              <w:right w:type="dxa" w:w="120"/>
-            </w:tcMar>
-            <w:vAlign w:val="center"/>
-          </w:tcPr>
-          <w:p>
-            <w:r>
-              <w:rPr>
-                <w:b w:val="false"/>
-                <w:bCs w:val="false"/>
-                <w:sz w:val="18"/>
-                <w:szCs w:val="18"/>
-              </w:rPr>
-              <w:t xml:space="preserve">—</w:t>
-            </w:r>
-          </w:p>
-        </w:tc>
-        <w:tc>
-          <w:tcPr>
-            <w:tcW w:type="dxa" w:w="1600"/>
-            <w:tcBorders>
-              <w:top w:val="single" w:color="CCCCCC" w:sz="1"/>
-              <w:left w:val="single" w:color="CCCCCC" w:sz="1"/>
-              <w:bottom w:val="single" w:color="CCCCCC" w:sz="1"/>
-              <w:right w:val="single" w:color="CCCCCC" w:sz="1"/>
-            </w:tcBorders>
-            <w:tcMar>
-              <w:top w:type="dxa" w:w="80"/>
-              <w:left w:type="dxa" w:w="120"/>
-              <w:bottom w:type="dxa" w:w="80"/>
-              <w:right w:type="dxa" w:w="120"/>
-            </w:tcMar>
-            <w:vAlign w:val="center"/>
-          </w:tcPr>
-          <w:p>
-            <w:r>
-              <w:rPr>
-                <w:b w:val="false"/>
-                <w:bCs w:val="false"/>
-                <w:sz w:val="18"/>
-                <w:szCs w:val="18"/>
-              </w:rPr>
-              <w:t>Pendiente</w:t>
-            </w:r>
-          </w:p>
-        </w:tc>
-      </w:tr>
     </w:tbl>
     <w:p>
       <w:r>
@@ -12111,7 +11818,7 @@
                 <w:sz w:val="18"/>
                 <w:szCs w:val="18"/>
               </w:rPr>
-              <w:t xml:space="preserve">Oftalmología — estudio previo</w:t>
+              <w:t>✅ Oftalmología — estudio previo — REALIZADA</w:t>
             </w:r>
           </w:p>
         </w:tc>
@@ -12140,7 +11847,7 @@
                 <w:sz w:val="18"/>
                 <w:szCs w:val="18"/>
               </w:rPr>
-              <w:t xml:space="preserve">18/05/2026 — 16:30 hs</w:t>
+              <w:t>18/05/2026 — 16:30 hs</w:t>
             </w:r>
           </w:p>
         </w:tc>
@@ -12169,7 +11876,7 @@
                 <w:sz w:val="18"/>
                 <w:szCs w:val="18"/>
               </w:rPr>
-              <w:t xml:space="preserve">Agendado</w:t>
+              <w:t>✅ Realizada</w:t>
             </w:r>
           </w:p>
         </w:tc>
@@ -12198,7 +11905,7 @@
                 <w:sz w:val="18"/>
                 <w:szCs w:val="18"/>
               </w:rPr>
-              <w:t xml:space="preserve">Posible estudio previo a la evaluación del 27/05.</w:t>
+              <w:t>Estudio previo realizado. Evaluación cirugía: 27/05/2026.</w:t>
             </w:r>
           </w:p>
         </w:tc>
@@ -14114,6 +13821,65 @@
                 <w:szCs w:val="18"/>
               </w:rPr>
               <w:t>Protocolo Actual — 5 cambios aprobados. 1) SAProCEA: estado actualizado a “✅ Matriculado” — certificado recibido el 07/05/2026. 2) Dr. Balasus (Harvard): dataset TROPOMI+GOSAT autorizado — pendiente cerrado. 3) Evento agregado: Striping + Baño Chet (mié 13/05, 17:00–18:00 hs). 4) Limpieza automática: filas Nutricionista 06/05 y Cumpleaños Novios 08/05 eliminadas; Nutricionista próxima actualizada a 03/06/2026. 5) Tabla Tesis: filas completadas de 29/04, 04/05, 07/05 y 08/05 eliminadas — solo queda el pendiente del 10/05.</w:t>
+            </w:r>
+          </w:p>
+        </w:tc>
+      </w:tr>
+      <w:tr>
+        <w:tc>
+          <w:tcPr>
+            <w:tcW w:type="dxa" w:w="1500"/>
+            <w:tcBorders>
+              <w:top w:val="single" w:color="CCCCCC" w:sz="1"/>
+              <w:left w:val="single" w:color="CCCCCC" w:sz="1"/>
+              <w:bottom w:val="single" w:color="CCCCCC" w:sz="1"/>
+              <w:right w:val="single" w:color="CCCCCC" w:sz="1"/>
+            </w:tcBorders>
+            <w:shd w:fill="F8F9FA" w:val="clear"/>
+            <w:tcMar>
+              <w:top w:type="dxa" w:w="80"/>
+              <w:left w:type="dxa" w:w="120"/>
+              <w:bottom w:type="dxa" w:w="80"/>
+              <w:right w:type="dxa" w:w="120"/>
+            </w:tcMar>
+            <w:vAlign w:val="center"/>
+          </w:tcPr>
+          <w:p>
+            <w:r>
+              <w:rPr>
+                <w:b/>
+                <w:bCs/>
+                <w:sz w:val="18"/>
+                <w:szCs w:val="18"/>
+              </w:rPr>
+              <w:t xml:space="preserve">19/05/2026</w:t>
+            </w:r>
+          </w:p>
+        </w:tc>
+        <w:tc>
+          <w:tcPr>
+            <w:tcW w:type="dxa" w:w="8220"/>
+            <w:tcBorders>
+              <w:top w:val="single" w:color="CCCCCC" w:sz="1"/>
+              <w:left w:val="single" w:color="CCCCCC" w:sz="1"/>
+              <w:bottom w:val="single" w:color="CCCCCC" w:sz="1"/>
+              <w:right w:val="single" w:color="CCCCCC" w:sz="1"/>
+            </w:tcBorders>
+            <w:tcMar>
+              <w:top w:type="dxa" w:w="80"/>
+              <w:left w:type="dxa" w:w="120"/>
+              <w:bottom w:type="dxa" w:w="80"/>
+              <w:right w:type="dxa" w:w="120"/>
+            </w:tcMar>
+            <w:vAlign w:val="center"/>
+          </w:tcPr>
+          <w:p>
+            <w:r>
+              <w:rPr>
+                <w:sz w:val="18"/>
+                <w:szCs w:val="18"/>
+              </w:rPr>
+              <w:t xml:space="preserve">Protocolo Actual — 6 acciones aprobadas. 1) Limpieza: eliminados 3 eventos pasados (Striping 13/05, MB Running 17/05, Oftalmología 18/05) y hito tesis 10/05. 2) Parcial Climatología: marcado ✅ Realizado (19/05). 3) Dental System 20/05 agregado a agenda. 4) Dr. Balasus: dataset TROPOMI+GOSAT ✅ autorizado (06/05). 5) Ecología Activa: primer lead registrado — descarga guía residuos (17/05). 6) SAProCEA: boletín técnico recibido (honorarios 2026 + novedades legislativas).</w:t>
             </w:r>
           </w:p>
         </w:tc>

</xml_diff>